<commit_message>
docs: finalize public installation paths
</commit_message>
<xml_diff>
--- a/docs/Auto-Tune软件安装手册.docx
+++ b/docs/Auto-Tune软件安装手册.docx
@@ -18,11 +18,7 @@
     </w:p>
     <w:p>
       <w:r>
-        <w:rPr>
-          <w:rFonts w:ascii="Aptos" w:hAnsi="Aptos" w:eastAsia="Microsoft YaHei"/>
-          <w:sz w:val="21"/>
-        </w:rPr>
-        <w:t>版本日期：2026-09-25</w:t>
+        <w:t>版本日期：2026-09-26</w:t>
       </w:r>
     </w:p>
     <w:p>
@@ -57,19 +53,7 @@
         <w:ind w:left="369"/>
       </w:pPr>
       <w:r>
-        <w:rPr>
-          <w:rFonts w:ascii="Aptos" w:hAnsi="Aptos" w:eastAsia="Microsoft YaHei"/>
-          <w:b/>
-          <w:sz w:val="21"/>
-        </w:rPr>
-        <w:t>Windows ZIP 安装</w:t>
-      </w:r>
-      <w:r>
-        <w:rPr>
-          <w:rFonts w:ascii="Aptos" w:hAnsi="Aptos" w:eastAsia="Microsoft YaHei"/>
-          <w:sz w:val="21"/>
-        </w:rPr>
-        <w:t>：适合在单台 Windows GPU 计算机上直接使用。安装程序自动建立软件专用 Python 环境，不要求用户预装 Conda、Python、Docker、WSL 或 CUDA Toolkit。</w:t>
+        <w:t>Windows ZIP 线下试用：适合单台 Windows GPU 工作站。安装包包含私有 Python 3.10 运行环境，不要求预装 Conda、Python、Docker、WSL 或 CUDA Toolkit；该包不公开下载，需要联系艾卡获取。</w:t>
       </w:r>
     </w:p>
     <w:p>
@@ -78,34 +62,7 @@
         <w:ind w:left="369"/>
       </w:pPr>
       <w:r>
-        <w:rPr>
-          <w:rFonts w:ascii="Aptos" w:hAnsi="Aptos" w:eastAsia="Microsoft YaHei"/>
-          <w:b/>
-          <w:sz w:val="21"/>
-        </w:rPr>
-        <w:t>Docker GPU 安装</w:t>
-      </w:r>
-      <w:r>
-        <w:rPr>
-          <w:rFonts w:ascii="Aptos" w:hAnsi="Aptos" w:eastAsia="Microsoft YaHei"/>
-          <w:sz w:val="21"/>
-        </w:rPr>
-        <w:t xml:space="preserve">：适合已经使用 Docker Desktop 或 Linux Docker Engine 管理服务的环境。只交付一个 </w:t>
-      </w:r>
-      <w:r>
-        <w:rPr>
-          <w:rFonts w:ascii="Consolas" w:hAnsi="Consolas" w:eastAsia="Microsoft YaHei"/>
-          <w:color w:val="303F51"/>
-          <w:sz w:val="19"/>
-        </w:rPr>
-        <w:t>auto-tune</w:t>
-      </w:r>
-      <w:r>
-        <w:rPr>
-          <w:rFonts w:ascii="Aptos" w:hAnsi="Aptos" w:eastAsia="Microsoft YaHei"/>
-          <w:sz w:val="21"/>
-        </w:rPr>
-        <w:t xml:space="preserve"> 镜像和一个 Studio 容器，正常启动即申请 NVIDIA GPU。</w:t>
+        <w:t>Docker GPU（官方推荐）：适合已经使用 Docker Desktop Linux Engine 或 Linux Docker Engine 的环境，公开镜像从 GHCR 拉取。开发者也可以在受控 Python 3.10 GPU 环境中从源码运行。</w:t>
       </w:r>
     </w:p>
     <w:p>
@@ -513,7 +470,12 @@
         <w:pStyle w:val="Heading1"/>
       </w:pPr>
       <w:r>
-        <w:t>3. Windows ZIP 安装</w:t>
+        <w:t>3. Windows ZIP 安装（线下试用）</w:t>
+      </w:r>
+    </w:p>
+    <w:p>
+      <w:r>
+        <w:t>Windows ZIP 不在公开 GitHub 仓库或 Release 中发布。以下步骤仅适用于已经从艾卡处取得对应版本安装包和完整 SHA-256 的用户；不要使用第三方镜像或来源不明的安装包。</w:t>
       </w:r>
     </w:p>
     <w:p>
@@ -1311,7 +1273,70 @@
         <w:pStyle w:val="Heading1"/>
       </w:pPr>
       <w:r>
-        <w:t>4. Docker GPU 安装</w:t>
+        <w:t>3.7 从源码运行（开发者）</w:t>
+      </w:r>
+    </w:p>
+    <w:p>
+      <w:r>
+        <w:t>Conda 用户可一次创建完整的 Python 3.10 GPU 环境：</w:t>
+      </w:r>
+    </w:p>
+    <w:p>
+      <w:r>
+        <w:t>conda env create -f environment.yml</w:t>
+      </w:r>
+    </w:p>
+    <w:p>
+      <w:r>
+        <w:t>conda activate auto_tune</w:t>
+      </w:r>
+    </w:p>
+    <w:p>
+      <w:r>
+        <w:t>python -m auto_tune.main</w:t>
+      </w:r>
+    </w:p>
+    <w:p>
+      <w:r>
+        <w:t>普通 Python 3.10/venv 用户按以下顺序安装。CUDA PyTorch 必须先从官方 CUDA 12.1 wheel 源安装：</w:t>
+      </w:r>
+    </w:p>
+    <w:p>
+      <w:r>
+        <w:t>python -m venv .venv</w:t>
+      </w:r>
+    </w:p>
+    <w:p>
+      <w:r>
+        <w:t>.\.venv\Scripts\Activate.ps1</w:t>
+      </w:r>
+    </w:p>
+    <w:p>
+      <w:r>
+        <w:t>python -m pip install --index-url https://download.pytorch.org/whl/cu121 torch==2.5.1 torchvision==0.20.1</w:t>
+      </w:r>
+    </w:p>
+    <w:p>
+      <w:r>
+        <w:t>python -m pip install -r requirements.txt</w:t>
+      </w:r>
+    </w:p>
+    <w:p>
+      <w:r>
+        <w:t>python -m auto_tune.main</w:t>
+      </w:r>
+    </w:p>
+    <w:p>
+      <w:r>
+        <w:t>两种源码方式都要求兼容的 NVIDIA GPU，不得静默降级为 CPU 训练。</w:t>
+      </w:r>
+    </w:p>
+    <w:p>
+      <w:pPr>
+        <w:pStyle w:val="Heading1"/>
+      </w:pPr>
+      <w:r>
+        <w:t>4. Docker GPU 安装（官方推荐）</w:t>
       </w:r>
     </w:p>
     <w:p>
@@ -1396,7 +1421,27 @@
         <w:pStyle w:val="Heading2"/>
       </w:pPr>
       <w:r>
-        <w:t>4.2 导入交付镜像</w:t>
+        <w:t>4.2 GHCR 在线拉取与离线导入</w:t>
+      </w:r>
+    </w:p>
+    <w:p>
+      <w:r>
+        <w:t>联网环境请直接拉取公开验收镜像：</w:t>
+      </w:r>
+    </w:p>
+    <w:p>
+      <w:r>
+        <w:t>docker pull ghcr.io/luzhaohao/auto-tune-studio:0.2.0</w:t>
+      </w:r>
+    </w:p>
+    <w:p>
+      <w:r>
+        <w:t>docker tag ghcr.io/luzhaohao/auto-tune-studio:0.2.0 auto-tune:local</w:t>
+      </w:r>
+    </w:p>
+    <w:p>
+      <w:r>
+        <w:t>完全离线环境如需镜像归档，请通过批准的线下渠道获取，并在导入前核对 SHA-256。</w:t>
       </w:r>
     </w:p>
     <w:p>

</xml_diff>